<commit_message>
Inventar hinfzugefügt für die Items, Styling dazu auch
</commit_message>
<xml_diff>
--- a/documentation/DEV.docx
+++ b/documentation/DEV.docx
@@ -104,6 +104,31 @@
     <w:p>
       <w:r>
         <w:t>HTML/CSS Grundgerüst komplett funktional</w:t>
+      </w:r>
+    </w:p>
+    <w:p/>
+    <w:p>
+      <w:pPr>
+        <w:rPr>
+          <w:b/>
+          <w:bCs/>
+          <w:sz w:val="28"/>
+          <w:szCs w:val="28"/>
+        </w:rPr>
+      </w:pPr>
+      <w:r>
+        <w:rPr>
+          <w:b/>
+          <w:bCs/>
+          <w:sz w:val="28"/>
+          <w:szCs w:val="28"/>
+        </w:rPr>
+        <w:t>Geschafft:</w:t>
+      </w:r>
+    </w:p>
+    <w:p>
+      <w:r>
+        <w:t>Ich habe beim Sprint #1 die Tutorial Seite gemacht, die Info Seite und die Spielseite in Basis-Version.</w:t>
       </w:r>
     </w:p>
     <w:p/>

</xml_diff>

<commit_message>
Antrag hinzugefügt (Bitte um verständnis)
</commit_message>
<xml_diff>
--- a/documentation/DEV.docx
+++ b/documentation/DEV.docx
@@ -69,7 +69,16 @@
           <w:sz w:val="28"/>
           <w:szCs w:val="28"/>
         </w:rPr>
-        <w:t>DEV-SPRINT #1</w:t>
+        <w:t>DEV-SPRINT #</w:t>
+      </w:r>
+      <w:r>
+        <w:rPr>
+          <w:b/>
+          <w:bCs/>
+          <w:sz w:val="28"/>
+          <w:szCs w:val="28"/>
+        </w:rPr>
+        <w:t>2</w:t>
       </w:r>
     </w:p>
     <w:p>
@@ -103,7 +112,40 @@
     </w:p>
     <w:p>
       <w:r>
-        <w:t>HTML/CSS Grundgerüst komplett funktional</w:t>
+        <w:t>Kernmechanik implementiert, Spiel in Basisfunktion spielbar</w:t>
+      </w:r>
+    </w:p>
+    <w:p>
+      <w:pPr>
+        <w:rPr>
+          <w:b/>
+          <w:bCs/>
+          <w:sz w:val="28"/>
+          <w:szCs w:val="28"/>
+        </w:rPr>
+      </w:pPr>
+      <w:r>
+        <w:rPr>
+          <w:b/>
+          <w:bCs/>
+          <w:sz w:val="28"/>
+          <w:szCs w:val="28"/>
+        </w:rPr>
+        <w:t>Geschafft:</w:t>
+      </w:r>
+    </w:p>
+    <w:p>
+      <w:r>
+        <w:t>Ich habe beim Sprint #</w:t>
+      </w:r>
+      <w:r>
+        <w:t>2</w:t>
+      </w:r>
+      <w:r>
+        <w:t xml:space="preserve"> </w:t>
+      </w:r>
+      <w:r>
+        <w:t>erfolgreich das Inventar hinzugefügt, regelmäßige commits gemacht, ebenfalls funktioniert das Pflanzen System und das Ernten</w:t>
       </w:r>
     </w:p>
     <w:p/>
@@ -123,12 +165,29 @@
           <w:sz w:val="28"/>
           <w:szCs w:val="28"/>
         </w:rPr>
-        <w:t>Geschafft:</w:t>
+        <w:t>Probleme:</w:t>
       </w:r>
     </w:p>
     <w:p>
-      <w:r>
-        <w:t>Ich habe beim Sprint #1 die Tutorial Seite gemacht, die Info Seite und die Spielseite in Basis-Version.</w:t>
+      <w:pPr>
+        <w:tabs>
+          <w:tab w:val="left" w:pos="6346"/>
+        </w:tabs>
+      </w:pPr>
+      <w:r>
+        <w:t>Ich bin leider</w:t>
+      </w:r>
+      <w:r>
+        <w:rPr>
+          <w:color w:val="000000"/>
+        </w:rPr>
+        <w:t xml:space="preserve"> </w:t>
+      </w:r>
+      <w:r>
+        <w:rPr>
+          <w:color w:val="000000"/>
+        </w:rPr>
+        <w:t>seit Montag krank. Ich habe heute versucht, am Medientechnik-Projekt weiterzuarbeiten, aber der Shop ist aufgrund meiner Erkrankung noch nicht ganz fertig geworden. Das Verkaufssystem funktioniert zwar bereits im Kern, ist aber noch nicht perfekt. Ich werde alles bis Freitag fertigstellen und hoffe auf Ihr Verständnis</w:t>
       </w:r>
     </w:p>
     <w:p/>
@@ -148,7 +207,16 @@
           <w:sz w:val="28"/>
           <w:szCs w:val="28"/>
         </w:rPr>
-        <w:t>Ziel bis zum DEV-SPRINT #2</w:t>
+        <w:t>Ziel bis zum DEV-SPRINT #</w:t>
+      </w:r>
+      <w:r>
+        <w:rPr>
+          <w:b/>
+          <w:bCs/>
+          <w:sz w:val="28"/>
+          <w:szCs w:val="28"/>
+        </w:rPr>
+        <w:t>3</w:t>
       </w:r>
       <w:r>
         <w:rPr>
@@ -162,7 +230,7 @@
     </w:p>
     <w:p>
       <w:r>
-        <w:t>Login Seite machen und daten speichern mittels LocalStorage und das Spiel in Basis-Version spielbar machen. Ebenfalls kaufbare Items im Shop hinzufügen und das wäre alles.</w:t>
+        <w:t xml:space="preserve">Die Buggs beheben bis Freitag, die Zusatz Mechaniken (Smellbar, Lehrer) implementieren und eine Libarry einbinden </w:t>
       </w:r>
     </w:p>
     <w:sectPr>
@@ -255,18 +323,14 @@
       <w:pStyle w:val="Kopfzeile"/>
     </w:pPr>
     <w:r>
-      <w:t>08.04.2026</w:t>
+      <w:t>21</w:t>
+    </w:r>
+    <w:r>
+      <w:t>.04.2026</w:t>
     </w:r>
     <w:r>
       <w:tab/>
-    </w:r>
-    <w:proofErr w:type="spellStart"/>
-    <w:r>
-      <w:t>Grow</w:t>
-    </w:r>
-    <w:proofErr w:type="spellEnd"/>
-    <w:r>
-      <w:t xml:space="preserve"> A Colony</w:t>
+      <w:t>Grow A Colony</w:t>
     </w:r>
     <w:r>
       <w:tab/>

</xml_diff>